<commit_message>
Update Project2 analysis, QGIS layout, and AI prompts log
Co-Authored-By: Claude Opus 5.5 <noreply@anthropic.com>
</commit_message>
<xml_diff>
--- a/docs/Project 2 AI Prompts.docx
+++ b/docs/Project 2 AI Prompts.docx
@@ -25,15 +25,7 @@
         <w:t>th</w:t>
       </w:r>
       <w:r>
-        <w:t xml:space="preserve"> </w:t>
-      </w:r>
-      <w:proofErr w:type="gramStart"/>
-      <w:r>
-        <w:t>Edition)(</w:t>
-      </w:r>
-      <w:proofErr w:type="gramEnd"/>
-      <w:r>
-        <w:t>USFS)</w:t>
+        <w:t xml:space="preserve"> Edition)(USFS)</w:t>
       </w:r>
     </w:p>
     <w:p>
@@ -45,7 +37,22 @@
         </w:numPr>
       </w:pPr>
       <w:r>
-        <w:t xml:space="preserve">Help me create a grid for a KD-Trees kernel density algorithm using fuel-type from the </w:t>
+        <w:t xml:space="preserve">Guide </w:t>
+      </w:r>
+      <w:r>
+        <w:t xml:space="preserve">me </w:t>
+      </w:r>
+      <w:r>
+        <w:t xml:space="preserve">through </w:t>
+      </w:r>
+      <w:r>
+        <w:t>creat</w:t>
+      </w:r>
+      <w:r>
+        <w:t>ing</w:t>
+      </w:r>
+      <w:r>
+        <w:t xml:space="preserve"> a grid for a KD-Trees kernel density algorithm using fuel-type from the </w:t>
       </w:r>
       <w:proofErr w:type="spellStart"/>
       <w:r>
@@ -54,6 +61,107 @@
       <w:proofErr w:type="spellEnd"/>
       <w:r>
         <w:t xml:space="preserve"> dataset via LANDFIRE to create grid values containing the majority fuel class</w:t>
+      </w:r>
+      <w:r>
+        <w:t>.</w:t>
+      </w:r>
+    </w:p>
+    <w:p>
+      <w:pPr>
+        <w:pStyle w:val="ListParagraph"/>
+        <w:numPr>
+          <w:ilvl w:val="0"/>
+          <w:numId w:val="1"/>
+        </w:numPr>
+      </w:pPr>
+      <w:r>
+        <w:t xml:space="preserve">Give me </w:t>
+      </w:r>
+      <w:r>
+        <w:t>the common</w:t>
+      </w:r>
+      <w:r>
+        <w:t xml:space="preserve"> libraries </w:t>
+      </w:r>
+      <w:r>
+        <w:t xml:space="preserve">geospatial data scientists use to </w:t>
+      </w:r>
+      <w:r>
+        <w:t xml:space="preserve">implement KDE's. I </w:t>
+      </w:r>
+      <w:r>
+        <w:t>am going</w:t>
+      </w:r>
+      <w:r>
+        <w:t xml:space="preserve"> to implement a KDE on this dataset </w:t>
+      </w:r>
+      <w:r>
+        <w:t xml:space="preserve">my fire point by fuel type dataset using a Gaussian function. </w:t>
+      </w:r>
+    </w:p>
+    <w:p>
+      <w:pPr>
+        <w:pStyle w:val="ListParagraph"/>
+        <w:numPr>
+          <w:ilvl w:val="0"/>
+          <w:numId w:val="1"/>
+        </w:numPr>
+      </w:pPr>
+      <w:r>
+        <w:t xml:space="preserve">What is a more </w:t>
+      </w:r>
+      <w:r>
+        <w:t>feasible</w:t>
+      </w:r>
+      <w:r>
+        <w:t xml:space="preserve"> com</w:t>
+      </w:r>
+      <w:r>
+        <w:t>pu</w:t>
+      </w:r>
+      <w:r>
+        <w:t xml:space="preserve">tational approach? Keep the same cell size and count per point using a smaller </w:t>
+      </w:r>
+      <w:r>
+        <w:t>bandwidth</w:t>
+      </w:r>
+      <w:r>
+        <w:t>, or drop the cell size and sum the counts in the cell?</w:t>
+      </w:r>
+      <w:r>
+        <w:t xml:space="preserve"> Explain the tradeoffs of these two approaches.</w:t>
+      </w:r>
+    </w:p>
+    <w:p>
+      <w:pPr>
+        <w:pStyle w:val="ListParagraph"/>
+        <w:numPr>
+          <w:ilvl w:val="0"/>
+          <w:numId w:val="1"/>
+        </w:numPr>
+      </w:pPr>
+      <w:r>
+        <w:t>Now that I have my grid constructed and I have summed the number of fires per grid. help me implement the KDE suggested. Walk through each step so I have an understanding of the code and the arguments being passed into the KDE function.</w:t>
+      </w:r>
+    </w:p>
+    <w:p>
+      <w:pPr>
+        <w:pStyle w:val="ListParagraph"/>
+        <w:numPr>
+          <w:ilvl w:val="0"/>
+          <w:numId w:val="1"/>
+        </w:numPr>
+      </w:pPr>
+      <w:r>
+        <w:t xml:space="preserve">Give me the typical libraries geospatial </w:t>
+      </w:r>
+      <w:proofErr w:type="spellStart"/>
+      <w:r>
+        <w:t>datascientists</w:t>
+      </w:r>
+      <w:proofErr w:type="spellEnd"/>
+      <w:r>
+        <w:t xml:space="preserve"> use to rasterize a KDE's. Tell me about the methods and what to take into account when rasterizing density point data.</w:t>
       </w:r>
     </w:p>
     <w:sectPr>

</xml_diff>

<commit_message>
Write up Project 2 report and harden devcontainer startup
- Expand Project2 notebook report write-up
- Update AI prompts log
- Reinstall Claude Code extension on container start when missing

Co-Authored-By: Claude Opus 5.5 <noreply@anthropic.com>
</commit_message>
<xml_diff>
--- a/docs/Project 2 AI Prompts.docx
+++ b/docs/Project 2 AI Prompts.docx
@@ -16,16 +16,25 @@
         </w:numPr>
       </w:pPr>
       <w:r>
-        <w:t>I have three geospatial datasets (Spatial wildfire occurrence data for the United States, 1992-2020 (7th</w:t>
-      </w:r>
-      <w:r>
-        <w:rPr>
-          <w:vertAlign w:val="superscript"/>
-        </w:rPr>
-        <w:t>th</w:t>
-      </w:r>
-      <w:r>
-        <w:t xml:space="preserve"> Edition)(USFS)</w:t>
+        <w:t xml:space="preserve">Guide </w:t>
+      </w:r>
+      <w:r>
+        <w:t xml:space="preserve">me </w:t>
+      </w:r>
+      <w:r>
+        <w:t xml:space="preserve">through </w:t>
+      </w:r>
+      <w:r>
+        <w:t>creat</w:t>
+      </w:r>
+      <w:r>
+        <w:t>ing</w:t>
+      </w:r>
+      <w:r>
+        <w:t xml:space="preserve"> a grid for a KD-Trees kernel density algorithm using fuel-type from the fuelClass dataset via LANDFIRE to create grid values containing the majority fuel class</w:t>
+      </w:r>
+      <w:r>
+        <w:t>.</w:t>
       </w:r>
     </w:p>
     <w:p>
@@ -37,33 +46,28 @@
         </w:numPr>
       </w:pPr>
       <w:r>
-        <w:t xml:space="preserve">Guide </w:t>
-      </w:r>
-      <w:r>
-        <w:t xml:space="preserve">me </w:t>
-      </w:r>
-      <w:r>
-        <w:t xml:space="preserve">through </w:t>
-      </w:r>
-      <w:r>
-        <w:t>creat</w:t>
-      </w:r>
-      <w:r>
-        <w:t>ing</w:t>
-      </w:r>
-      <w:r>
-        <w:t xml:space="preserve"> a grid for a KD-Trees kernel density algorithm using fuel-type from the </w:t>
-      </w:r>
-      <w:proofErr w:type="spellStart"/>
-      <w:r>
-        <w:t>fuelClass</w:t>
-      </w:r>
-      <w:proofErr w:type="spellEnd"/>
-      <w:r>
-        <w:t xml:space="preserve"> dataset via LANDFIRE to create grid values containing the majority fuel class</w:t>
-      </w:r>
-      <w:r>
-        <w:t>.</w:t>
+        <w:t xml:space="preserve">Give me </w:t>
+      </w:r>
+      <w:r>
+        <w:t>the common</w:t>
+      </w:r>
+      <w:r>
+        <w:t xml:space="preserve"> libraries </w:t>
+      </w:r>
+      <w:r>
+        <w:t xml:space="preserve">geospatial data scientists use to </w:t>
+      </w:r>
+      <w:r>
+        <w:t xml:space="preserve">implement KDE's. I </w:t>
+      </w:r>
+      <w:r>
+        <w:t>am going</w:t>
+      </w:r>
+      <w:r>
+        <w:t xml:space="preserve"> to implement a KDE on this dataset </w:t>
+      </w:r>
+      <w:r>
+        <w:t xml:space="preserve">my fire point by fuel type dataset using a Gaussian function. </w:t>
       </w:r>
     </w:p>
     <w:p>
@@ -75,28 +79,16 @@
         </w:numPr>
       </w:pPr>
       <w:r>
-        <w:t xml:space="preserve">Give me </w:t>
-      </w:r>
-      <w:r>
-        <w:t>the common</w:t>
-      </w:r>
-      <w:r>
-        <w:t xml:space="preserve"> libraries </w:t>
-      </w:r>
-      <w:r>
-        <w:t xml:space="preserve">geospatial data scientists use to </w:t>
-      </w:r>
-      <w:r>
-        <w:t xml:space="preserve">implement KDE's. I </w:t>
-      </w:r>
-      <w:r>
-        <w:t>am going</w:t>
-      </w:r>
-      <w:r>
-        <w:t xml:space="preserve"> to implement a KDE on this dataset </w:t>
-      </w:r>
-      <w:r>
-        <w:t xml:space="preserve">my fire point by fuel type dataset using a Gaussian function. </w:t>
+        <w:t>What is a more feasible com</w:t>
+      </w:r>
+      <w:r>
+        <w:t>pu</w:t>
+      </w:r>
+      <w:r>
+        <w:t>tational approach? Keep the same cell size and count per point using a smaller bandwidth, or drop the cell size and sum the counts in the cell?</w:t>
+      </w:r>
+      <w:r>
+        <w:t xml:space="preserve"> Explain the tradeoffs of these two approaches.</w:t>
       </w:r>
     </w:p>
     <w:p>
@@ -108,28 +100,7 @@
         </w:numPr>
       </w:pPr>
       <w:r>
-        <w:t xml:space="preserve">What is a more </w:t>
-      </w:r>
-      <w:r>
-        <w:t>feasible</w:t>
-      </w:r>
-      <w:r>
-        <w:t xml:space="preserve"> com</w:t>
-      </w:r>
-      <w:r>
-        <w:t>pu</w:t>
-      </w:r>
-      <w:r>
-        <w:t xml:space="preserve">tational approach? Keep the same cell size and count per point using a smaller </w:t>
-      </w:r>
-      <w:r>
-        <w:t>bandwidth</w:t>
-      </w:r>
-      <w:r>
-        <w:t>, or drop the cell size and sum the counts in the cell?</w:t>
-      </w:r>
-      <w:r>
-        <w:t xml:space="preserve"> Explain the tradeoffs of these two approaches.</w:t>
+        <w:t>Now that I have my grid constructed and I have summed the number of fires per grid. help me implement the KDE suggested. Walk through each step so I have an understanding of the code and the arguments being passed into the KDE function.</w:t>
       </w:r>
     </w:p>
     <w:p>
@@ -141,27 +112,7 @@
         </w:numPr>
       </w:pPr>
       <w:r>
-        <w:t>Now that I have my grid constructed and I have summed the number of fires per grid. help me implement the KDE suggested. Walk through each step so I have an understanding of the code and the arguments being passed into the KDE function.</w:t>
-      </w:r>
-    </w:p>
-    <w:p>
-      <w:pPr>
-        <w:pStyle w:val="ListParagraph"/>
-        <w:numPr>
-          <w:ilvl w:val="0"/>
-          <w:numId w:val="1"/>
-        </w:numPr>
-      </w:pPr>
-      <w:r>
-        <w:t xml:space="preserve">Give me the typical libraries geospatial </w:t>
-      </w:r>
-      <w:proofErr w:type="spellStart"/>
-      <w:r>
-        <w:t>datascientists</w:t>
-      </w:r>
-      <w:proofErr w:type="spellEnd"/>
-      <w:r>
-        <w:t xml:space="preserve"> use to rasterize a KDE's. Tell me about the methods and what to take into account when rasterizing density point data.</w:t>
+        <w:t>Give me the typical libraries geospatial datascientists use to rasterize a KDE's. Tell me about the methods and what to take into account when rasterizing density point data.</w:t>
       </w:r>
     </w:p>
     <w:sectPr>
@@ -874,6 +825,7 @@
   <w:style w:type="character" w:default="1" w:styleId="DefaultParagraphFont">
     <w:name w:val="Default Paragraph Font"/>
     <w:uiPriority w:val="1"/>
+    <w:semiHidden/>
     <w:unhideWhenUsed/>
   </w:style>
   <w:style w:type="table" w:default="1" w:styleId="TableNormal">

</xml_diff>